<commit_message>
Editorial revision: accuracy fixes, verified references, reproducible tuning
- run.py --tune reproduces the GBDT hyper-parameter selection and ontology coverage
- manuscript: corrected over-claims, verified article numbers, tighter layout

Co-Authored-By: Claude Opus 5.5 <noreply@anthropic.com>
Claude-Session: https://claude.ai/code/session_01WRgK6kBj7HrBDhj733BbEk
</commit_message>
<xml_diff>
--- a/paper/manuscript.docx
+++ b/paper/manuscript.docx
@@ -177,7 +177,7 @@
           <w:sz w:val="24"/>
           <w:szCs w:val="24"/>
         </w:rPr>
-        <w:t xml:space="preserve">Startups are a primary vehicle through which innovation and digital transformation reach the economy, yet most of them fail, and investors must decide under severe uncertainty which ventures to back. Machine learning (ML) on large venture databases such as Crunchbase has therefore become an active research area, ranging from early outcome classifiers [1,2] and decision-support benchmarks for venture capital [3] to bias-free evaluation protocols [4,5], exit-prediction systems [6] and portfolio simulation [7]. A recent meta-analysis of AI-based success predictors finds that funding history, investor structure and firm characteristics are the most consistently informative signals, but that their importance shifts with the outcome definition and data source [8].</w:t>
+        <w:t xml:space="preserve">Startups are a primary vehicle through which innovation and digital transformation reach the economy, yet most of them fail, and investors must decide under severe uncertainty which ventures to back. Machine learning (ML) on large venture databases such as Crunchbase has therefore become an active research area, ranging from outcome classifiers [1,2] and decision-support benchmarks for venture capital [3] to bias-free evaluation protocols [4,5], exit-prediction systems [6] and portfolio simulation [7]. A recent meta-analysis finds funding history, investor structure and firm characteristics to be the most consistent predictors, with importance shifting across outcome definitions and data sources [8].</w:t>
       </w:r>
     </w:p>
     <w:p>
@@ -282,6 +282,22 @@
     </w:p>
     <w:p>
       <w:pPr>
+        <w:pStyle w:val="Heading2"/>
+        <w:spacing w:after="0" w:before="120" w:line="480"/>
+      </w:pPr>
+      <w:r>
+        <w:rPr>
+          <w:rFonts w:ascii="Times New Roman" w:cs="Times New Roman" w:eastAsia="Times New Roman" w:hAnsi="Times New Roman"/>
+          <w:i/>
+          <w:iCs/>
+          <w:sz w:val="24"/>
+          <w:szCs w:val="24"/>
+        </w:rPr>
+        <w:t xml:space="preserve">2.1 Data and prediction task</w:t>
+      </w:r>
+    </w:p>
+    <w:p>
+      <w:pPr>
         <w:spacing w:after="0" w:line="480"/>
         <w:ind w:firstLine="360"/>
         <w:jc w:val="both"/>
@@ -292,7 +308,133 @@
           <w:sz w:val="24"/>
           <w:szCs w:val="24"/>
         </w:rPr>
-        <w:t xml:space="preserve">Fig. 1 gives an overview. Raw firm records and codified expert knowledge produce four knowledge layers, a constrained learner combines them, and the result is explained at the level of knowledge sources.</w:t>
+        <w:t xml:space="preserve">The study uses the public Crunchbase export distributed on Kaggle [16], which describes 49,436 organisations with their categories, location, founding date and funding history by instrument (seed, angel, Series A–H, debt, grants, crowdfunding and others) up to 2014. Following prior work [4,6], success is defined as acquisition (</w:t>
+      </w:r>
+      <w:r>
+        <w:rPr>
+          <w:rFonts w:ascii="Times New Roman" w:cs="Times New Roman" w:eastAsia="Times New Roman" w:hAnsi="Times New Roman"/>
+          <w:i/>
+          <w:iCs/>
+          <w:sz w:val="24"/>
+          <w:szCs w:val="24"/>
+        </w:rPr>
+        <w:t xml:space="preserve">y</w:t>
+      </w:r>
+      <w:r>
+        <w:rPr>
+          <w:rFonts w:ascii="Times New Roman" w:cs="Times New Roman" w:eastAsia="Times New Roman" w:hAnsi="Times New Roman"/>
+          <w:sz w:val="24"/>
+          <w:szCs w:val="24"/>
+        </w:rPr>
+        <w:t xml:space="preserve"> = 1) and failure as closure (</w:t>
+      </w:r>
+      <w:r>
+        <w:rPr>
+          <w:rFonts w:ascii="Times New Roman" w:cs="Times New Roman" w:eastAsia="Times New Roman" w:hAnsi="Times New Roman"/>
+          <w:i/>
+          <w:iCs/>
+          <w:sz w:val="24"/>
+          <w:szCs w:val="24"/>
+        </w:rPr>
+        <w:t xml:space="preserve">y</w:t>
+      </w:r>
+      <w:r>
+        <w:rPr>
+          <w:rFonts w:ascii="Times New Roman" w:cs="Times New Roman" w:eastAsia="Times New Roman" w:hAnsi="Times New Roman"/>
+          <w:sz w:val="24"/>
+          <w:szCs w:val="24"/>
+        </w:rPr>
+        <w:t xml:space="preserve"> = 0); firms that are still operating are unresolved and are not labelled. This yields 6,295 labelled startups (3,692 acquired, 2,603 closed). The </w:t>
+      </w:r>
+      <w:r>
+        <w:rPr>
+          <w:rFonts w:ascii="Times New Roman" w:cs="Times New Roman" w:eastAsia="Times New Roman" w:hAnsi="Times New Roman"/>
+          <w:i/>
+          <w:iCs/>
+          <w:sz w:val="24"/>
+          <w:szCs w:val="24"/>
+        </w:rPr>
+        <w:t xml:space="preserve">Base</w:t>
+      </w:r>
+      <w:r>
+        <w:rPr>
+          <w:rFonts w:ascii="Times New Roman" w:cs="Times New Roman" w:eastAsia="Times New Roman" w:hAnsi="Times New Roman"/>
+          <w:sz w:val="24"/>
+          <w:szCs w:val="24"/>
+        </w:rPr>
+        <w:t xml:space="preserve"> representation contains the 70 features a standard pipeline would use: log amounts per funding instrument, number of rounds, founding and first-funding year, and indicators for the 30 most frequent markets and 15 most frequent countries. The task is to estimate </w:t>
+      </w:r>
+      <w:r>
+        <w:rPr>
+          <w:rFonts w:ascii="Times New Roman" w:cs="Times New Roman" w:eastAsia="Times New Roman" w:hAnsi="Times New Roman"/>
+          <w:i/>
+          <w:iCs/>
+          <w:sz w:val="24"/>
+          <w:szCs w:val="24"/>
+        </w:rPr>
+        <w:t xml:space="preserve">p</w:t>
+      </w:r>
+      <w:r>
+        <w:rPr>
+          <w:rFonts w:ascii="Times New Roman" w:cs="Times New Roman" w:eastAsia="Times New Roman" w:hAnsi="Times New Roman"/>
+          <w:sz w:val="24"/>
+          <w:szCs w:val="24"/>
+        </w:rPr>
+        <w:t xml:space="preserve">(</w:t>
+      </w:r>
+      <w:r>
+        <w:rPr>
+          <w:rFonts w:ascii="Times New Roman" w:cs="Times New Roman" w:eastAsia="Times New Roman" w:hAnsi="Times New Roman"/>
+          <w:i/>
+          <w:iCs/>
+          <w:sz w:val="24"/>
+          <w:szCs w:val="24"/>
+        </w:rPr>
+        <w:t xml:space="preserve">y</w:t>
+      </w:r>
+      <w:r>
+        <w:rPr>
+          <w:rFonts w:ascii="Times New Roman" w:cs="Times New Roman" w:eastAsia="Times New Roman" w:hAnsi="Times New Roman"/>
+          <w:sz w:val="24"/>
+          <w:szCs w:val="24"/>
+        </w:rPr>
+        <w:t xml:space="preserve"> = 1 | </w:t>
+      </w:r>
+      <w:r>
+        <w:rPr>
+          <w:rFonts w:ascii="Times New Roman" w:cs="Times New Roman" w:eastAsia="Times New Roman" w:hAnsi="Times New Roman"/>
+          <w:b/>
+          <w:bCs/>
+          <w:sz w:val="24"/>
+          <w:szCs w:val="24"/>
+        </w:rPr>
+        <w:t xml:space="preserve">x</w:t>
+      </w:r>
+      <w:r>
+        <w:rPr>
+          <w:rFonts w:ascii="Times New Roman" w:cs="Times New Roman" w:eastAsia="Times New Roman" w:hAnsi="Times New Roman"/>
+          <w:sz w:val="24"/>
+          <w:szCs w:val="24"/>
+        </w:rPr>
+        <w:t xml:space="preserve">) for a startup described by </w:t>
+      </w:r>
+      <w:r>
+        <w:rPr>
+          <w:rFonts w:ascii="Times New Roman" w:cs="Times New Roman" w:eastAsia="Times New Roman" w:hAnsi="Times New Roman"/>
+          <w:b/>
+          <w:bCs/>
+          <w:sz w:val="24"/>
+          <w:szCs w:val="24"/>
+        </w:rPr>
+        <w:t xml:space="preserve">x</w:t>
+      </w:r>
+      <w:r>
+        <w:rPr>
+          <w:rFonts w:ascii="Times New Roman" w:cs="Times New Roman" w:eastAsia="Times New Roman" w:hAnsi="Times New Roman"/>
+          <w:sz w:val="24"/>
+          <w:szCs w:val="24"/>
+        </w:rPr>
+        <w:t xml:space="preserve">; Fig. 1 gives an overview of how KEXS enriches and constrains this estimate.</w:t>
       </w:r>
     </w:p>
     <w:p>
@@ -303,7 +445,7 @@
       <w:r>
         <w:drawing>
           <wp:inline distT="0" distB="0" distL="0" distR="0">
-            <wp:extent cx="5762625" cy="2505075"/>
+            <wp:extent cx="5486400" cy="2381250"/>
             <wp:effectExtent t="0" r="0" b="0" l="0"/>
             <wp:docPr id="1" name="Figure_1" descr="Overview of the KEXS framework. Raw Crunchbase records and expert knowledge produce four knowledge layers (K1–K4); gradient-boosted trees learn from them under knowledge-based monotone constraints (K5) and output an exit probability with group-level and feature-level explanations." title="Figure 1"/>
             <wp:cNvGraphicFramePr>
@@ -328,7 +470,7 @@
                   <pic:spPr bwMode="auto">
                     <a:xfrm>
                       <a:off x="0" y="0"/>
-                      <a:ext cx="5762625" cy="2505075"/>
+                      <a:ext cx="5486400" cy="2381250"/>
                     </a:xfrm>
                     <a:prstGeom prst="rect">
                       <a:avLst/>
@@ -378,163 +520,6 @@
           <w:sz w:val="24"/>
           <w:szCs w:val="24"/>
         </w:rPr>
-        <w:t xml:space="preserve">2.1 Data and prediction task</w:t>
-      </w:r>
-    </w:p>
-    <w:p>
-      <w:pPr>
-        <w:spacing w:after="0" w:line="480"/>
-        <w:ind w:firstLine="360"/>
-        <w:jc w:val="both"/>
-      </w:pPr>
-      <w:r>
-        <w:rPr>
-          <w:rFonts w:ascii="Times New Roman" w:cs="Times New Roman" w:eastAsia="Times New Roman" w:hAnsi="Times New Roman"/>
-          <w:sz w:val="24"/>
-          <w:szCs w:val="24"/>
-        </w:rPr>
-        <w:t xml:space="preserve">The study uses the public Crunchbase export distributed on Kaggle [16], which describes 49,436 organisations with their categories, location, founding date and funding history by instrument (seed, angel, Series A–H, debt, grants, crowdfunding and others) up to 2014. Following prior work [4,6], success is defined as acquisition (</w:t>
-      </w:r>
-      <w:r>
-        <w:rPr>
-          <w:rFonts w:ascii="Times New Roman" w:cs="Times New Roman" w:eastAsia="Times New Roman" w:hAnsi="Times New Roman"/>
-          <w:i/>
-          <w:iCs/>
-          <w:sz w:val="24"/>
-          <w:szCs w:val="24"/>
-        </w:rPr>
-        <w:t xml:space="preserve">y</w:t>
-      </w:r>
-      <w:r>
-        <w:rPr>
-          <w:rFonts w:ascii="Times New Roman" w:cs="Times New Roman" w:eastAsia="Times New Roman" w:hAnsi="Times New Roman"/>
-          <w:sz w:val="24"/>
-          <w:szCs w:val="24"/>
-        </w:rPr>
-        <w:t xml:space="preserve"> = 1) and failure as closure (</w:t>
-      </w:r>
-      <w:r>
-        <w:rPr>
-          <w:rFonts w:ascii="Times New Roman" w:cs="Times New Roman" w:eastAsia="Times New Roman" w:hAnsi="Times New Roman"/>
-          <w:i/>
-          <w:iCs/>
-          <w:sz w:val="24"/>
-          <w:szCs w:val="24"/>
-        </w:rPr>
-        <w:t xml:space="preserve">y</w:t>
-      </w:r>
-      <w:r>
-        <w:rPr>
-          <w:rFonts w:ascii="Times New Roman" w:cs="Times New Roman" w:eastAsia="Times New Roman" w:hAnsi="Times New Roman"/>
-          <w:sz w:val="24"/>
-          <w:szCs w:val="24"/>
-        </w:rPr>
-        <w:t xml:space="preserve"> = 0); firms that are still operating are unresolved and are not labelled. This yields 6,295 labelled startups (3,692 acquired, 2,603 closed). The </w:t>
-      </w:r>
-      <w:r>
-        <w:rPr>
-          <w:rFonts w:ascii="Times New Roman" w:cs="Times New Roman" w:eastAsia="Times New Roman" w:hAnsi="Times New Roman"/>
-          <w:i/>
-          <w:iCs/>
-          <w:sz w:val="24"/>
-          <w:szCs w:val="24"/>
-        </w:rPr>
-        <w:t xml:space="preserve">Base</w:t>
-      </w:r>
-      <w:r>
-        <w:rPr>
-          <w:rFonts w:ascii="Times New Roman" w:cs="Times New Roman" w:eastAsia="Times New Roman" w:hAnsi="Times New Roman"/>
-          <w:sz w:val="24"/>
-          <w:szCs w:val="24"/>
-        </w:rPr>
-        <w:t xml:space="preserve"> representation contains the 70 features a standard pipeline would use: log amounts per funding instrument, number of rounds, founding and first-funding year, and indicators for the 30 most frequent markets and 15 most frequent countries. The task is to estimate </w:t>
-      </w:r>
-      <w:r>
-        <w:rPr>
-          <w:rFonts w:ascii="Times New Roman" w:cs="Times New Roman" w:eastAsia="Times New Roman" w:hAnsi="Times New Roman"/>
-          <w:i/>
-          <w:iCs/>
-          <w:sz w:val="24"/>
-          <w:szCs w:val="24"/>
-        </w:rPr>
-        <w:t xml:space="preserve">p</w:t>
-      </w:r>
-      <w:r>
-        <w:rPr>
-          <w:rFonts w:ascii="Times New Roman" w:cs="Times New Roman" w:eastAsia="Times New Roman" w:hAnsi="Times New Roman"/>
-          <w:sz w:val="24"/>
-          <w:szCs w:val="24"/>
-        </w:rPr>
-        <w:t xml:space="preserve">(</w:t>
-      </w:r>
-      <w:r>
-        <w:rPr>
-          <w:rFonts w:ascii="Times New Roman" w:cs="Times New Roman" w:eastAsia="Times New Roman" w:hAnsi="Times New Roman"/>
-          <w:i/>
-          <w:iCs/>
-          <w:sz w:val="24"/>
-          <w:szCs w:val="24"/>
-        </w:rPr>
-        <w:t xml:space="preserve">y</w:t>
-      </w:r>
-      <w:r>
-        <w:rPr>
-          <w:rFonts w:ascii="Times New Roman" w:cs="Times New Roman" w:eastAsia="Times New Roman" w:hAnsi="Times New Roman"/>
-          <w:sz w:val="24"/>
-          <w:szCs w:val="24"/>
-        </w:rPr>
-        <w:t xml:space="preserve"> = 1 | </w:t>
-      </w:r>
-      <w:r>
-        <w:rPr>
-          <w:rFonts w:ascii="Times New Roman" w:cs="Times New Roman" w:eastAsia="Times New Roman" w:hAnsi="Times New Roman"/>
-          <w:b/>
-          <w:bCs/>
-          <w:sz w:val="24"/>
-          <w:szCs w:val="24"/>
-        </w:rPr>
-        <w:t xml:space="preserve">x</w:t>
-      </w:r>
-      <w:r>
-        <w:rPr>
-          <w:rFonts w:ascii="Times New Roman" w:cs="Times New Roman" w:eastAsia="Times New Roman" w:hAnsi="Times New Roman"/>
-          <w:sz w:val="24"/>
-          <w:szCs w:val="24"/>
-        </w:rPr>
-        <w:t xml:space="preserve">) for a startup described by </w:t>
-      </w:r>
-      <w:r>
-        <w:rPr>
-          <w:rFonts w:ascii="Times New Roman" w:cs="Times New Roman" w:eastAsia="Times New Roman" w:hAnsi="Times New Roman"/>
-          <w:b/>
-          <w:bCs/>
-          <w:sz w:val="24"/>
-          <w:szCs w:val="24"/>
-        </w:rPr>
-        <w:t xml:space="preserve">x</w:t>
-      </w:r>
-      <w:r>
-        <w:rPr>
-          <w:rFonts w:ascii="Times New Roman" w:cs="Times New Roman" w:eastAsia="Times New Roman" w:hAnsi="Times New Roman"/>
-          <w:sz w:val="24"/>
-          <w:szCs w:val="24"/>
-        </w:rPr>
-        <w:t xml:space="preserve">.</w:t>
-      </w:r>
-    </w:p>
-    <w:p>
-      <w:pPr>
-        <w:pStyle w:val="Heading2"/>
-        <w:spacing w:after="0" w:before="120" w:line="480"/>
-      </w:pPr>
-      <w:r>
-        <w:rPr>
-          <w:rFonts w:ascii="Times New Roman" w:cs="Times New Roman" w:eastAsia="Times New Roman" w:hAnsi="Times New Roman"/>
-          <w:i/>
-          <w:iCs/>
-          <w:sz w:val="24"/>
-          <w:szCs w:val="24"/>
-        </w:rPr>
         <w:t xml:space="preserve">2.2 Knowledge layers K1–K4</w:t>
       </w:r>
     </w:p>
@@ -904,7 +889,7 @@
           <w:sz w:val="24"/>
           <w:szCs w:val="24"/>
         </w:rPr>
-        <w:t xml:space="preserve"> is the total; PPMI factorisation is equivalent to a skip-gram embedding [17]. A 16-dimensional spectral embedding of the PPMI matrix (truncated SVD) places related markets close together, and each firm is represented by the mean embedding of its categories. The graph is built from all 49,436 firms, including the unresolved ones, but uses no outcome label. </w:t>
+        <w:t xml:space="preserve"> is the total; a truncated SVD of a PPMI matrix is a well-established count-based counterpart of skip-gram embeddings, which implicitly factorise a shifted PMI matrix [17]. A 16-dimensional spectral embedding of the PPMI matrix (truncated SVD) places related markets close together, and each firm is represented by the mean embedding of its categories. The graph is built from all 49,436 firms, including the unresolved ones, but uses no outcome label. </w:t>
       </w:r>
       <w:r>
         <w:rPr>
@@ -3342,7 +3327,7 @@
           <w:sz w:val="24"/>
           <w:szCs w:val="24"/>
         </w:rPr>
-        <w:t xml:space="preserve">All models were evaluated by 5-fold stratified cross-validation repeated three times (15 folds). The baselines are logistic regression (LR), a multilayer perceptron (MLP), a random forest (RF) and the same gradient-boosted trees (GBDT) used by KEXS; each is trained once on the Base features and once on Base + K1–K4, so every knowledge effect is measured against an otherwise identical model. GBDT hyper-parameters (learning rate 0.03, 300 trees, 7 leaves, minimum leaf size 80, L2 penalty 5) were selected once on the Base features with a different random split and then frozen for every feature set, which favours the baseline rather than KEXS. Differences in fold-level AUC are tested with the Nadeau–Bengio corrected resampled t-test [22], which accounts for the overlap between training sets that inflates naive paired tests.</w:t>
+        <w:t xml:space="preserve">All models were evaluated by 5-fold stratified cross-validation repeated three times (15 folds). The baselines are logistic regression (LR), a multilayer perceptron (MLP), a random forest (RF) and the same gradient-boosted trees (GBDT) used by KEXS; each is trained once on the Base features and once on Base + K1–K4, so every knowledge effect is measured against an otherwise identical model. GBDT hyper-parameters (learning rate 0.03, 300 trees, 7 leaves, minimum leaf size 80, L2 penalty 5) were selected once on the Base features with a different random split and then frozen for every feature set, which favours the baseline rather than KEXS (the selection grid is reproduced by run.py --tune). Differences in fold-level AUC are tested with the Nadeau–Bengio corrected resampled t-test [22], which accounts for the overlap between training sets that inflates naive paired tests.</w:t>
       </w:r>
     </w:p>
     <w:p>
@@ -3357,7 +3342,7 @@
           <w:sz w:val="24"/>
           <w:szCs w:val="24"/>
         </w:rPr>
-        <w:t xml:space="preserve">Because cross-validation mixes cohorts, a strict temporal hold-out was added: models are trained on the 4,003 startups first funded up to 2009 and tested on the 2,291 first funded in 2010–2014. In this setting the K2 graph, the K4 statistics and the Base vocabularies are rebuilt from the training period only, so no information from the test cohort enters the knowledge layers, and 95% confidence intervals are obtained from 2,000 paired bootstrap resamples. Metrics are ROC-AUC, PR-AUC, Brier score and balanced accuracy. All experiments use scikit-learn [23] with a fixed seed and are reproduced end-to-end by a single script [24].</w:t>
+        <w:t xml:space="preserve">Because cross-validation mixes cohorts, a strict temporal hold-out was added. Models are trained on the 4,003 startups first funded up to 2009 and tested on the 2,291 first funded in 2010–2014 (one startup without a first-funding date is excluded). Here the K2 graph, K4 statistics and Base vocabularies are rebuilt from the training period only, so no test-cohort information enters the knowledge layers; 95% confidence intervals come from 2,000 paired bootstrap resamples. Metrics are ROC-AUC, PR-AUC, Brier score and balanced accuracy. All experiments use scikit-learn [23] with a fixed seed and are reproduced end-to-end by a single script [24].</w:t>
       </w:r>
     </w:p>
     <w:p>
@@ -3388,7 +3373,7 @@
           <w:sz w:val="24"/>
           <w:szCs w:val="24"/>
         </w:rPr>
-        <w:t xml:space="preserve">Table 2 and Fig. 2 report the predictive results. KEXS attains a ROC-AUC of 0.812 and a PR-AUC of 0.851, the best of all nine configurations, against 0.800 for the identical data-only GBDT and 0.798 for the strongest data-only alternative (RF). The gain of +0.012 AUC is consistent across folds (p &lt; 0.001) and carries over to the 2010–2014 cohort (+0.012 [+0.003, +0.022]), whose confidence interval excludes zero even though the test cohort has a markedly different base rate (51% acquired vs. 59% overall). The Brier score falls together with discrimination, so the improvement is not a ranking artefact.</w:t>
+        <w:t xml:space="preserve">Table 2 and Fig. 2 report the predictive results. KEXS attains a ROC-AUC of 0.812 and a PR-AUC of 0.851, statistically indistinguishable from the unconstrained GBDT with the same knowledge layers and above every data-only learner: 0.800 for the identical data-only GBDT and 0.798 for the strongest data-only alternative (RF). The gain of +0.012 AUC is consistent across folds (p &lt; 0.001) and carries over to the 2010–2014 cohort (+0.012 [+0.003, +0.022]), whose confidence interval excludes zero even though the test cohort has a markedly different base rate (51% acquired vs. 59% overall). The Brier score falls together with discrimination, so the improvement is not a ranking artefact.</w:t>
       </w:r>
     </w:p>
     <w:p>
@@ -6122,7 +6107,7 @@
       <w:r>
         <w:drawing>
           <wp:inline distT="0" distB="0" distL="0" distR="0">
-            <wp:extent cx="5762625" cy="2447925"/>
+            <wp:extent cx="5486400" cy="2333625"/>
             <wp:effectExtent t="0" r="0" b="0" l="0"/>
             <wp:docPr id="2" name="Figure_2" descr="Predictive performance. (a) Pooled out-of-fold ROC curves (first repetition) of the data-only GBDT and KEXS. (b) ROC-AUC on the 2010–2014 temporal hold-out for each learner with Base features and with knowledge layers; labels show the change." title="Figure 2"/>
             <wp:cNvGraphicFramePr>
@@ -6147,7 +6132,7 @@
                   <pic:spPr bwMode="auto">
                     <a:xfrm>
                       <a:off x="0" y="0"/>
-                      <a:ext cx="5762625" cy="2447925"/>
+                      <a:ext cx="5486400" cy="2333625"/>
                     </a:xfrm>
                     <a:prstGeom prst="rect">
                       <a:avLst/>
@@ -6211,7 +6196,7 @@
           <w:sz w:val="24"/>
           <w:szCs w:val="24"/>
         </w:rPr>
-        <w:t xml:space="preserve">Fig. 3 decomposes the full model. A model given only K1–K4, without any raw Base feature, reaches an AUC of 0.793, close to the 0.798 of the Base features alone, so the knowledge layers form an almost complete alternative description of a startup. The exact group-Shapley values attribute 63% of the full model's discriminative power above chance to knowledge layers—K3 31%, K4 15%, K2 10% and K1 8%—against 37% for Base. Leave-one-group-out drops (Fig. 3b) are much smaller than the Shapley values because K3 and Base share information; removal tests credit shared information to neither group, whereas Shapley values split it fairly, which is why the group-level game is the more informative design tool.</w:t>
+        <w:t xml:space="preserve">Fig. 3 decomposes the full model. The attribution game uses the unconstrained GBDT and one 5-fold split. In it, a model given only K1–K4, without any raw Base feature, reaches an AUC of 0.793, close to the 0.798 of the Base features alone, so the knowledge layers form an almost complete alternative description of a startup. The exact group-Shapley values attribute 63% of the full model's discriminative power above chance to knowledge layers—K3 31%, K4 15%, K2 10% and K1 8%—against 37% for Base. Leave-one-group-out drops (Fig. 3b) are much smaller than the Shapley values because K3 and Base share information; removal tests credit shared information to neither group, whereas Shapley values split it fairly, which is why the group-level game is the more informative design tool.</w:t>
       </w:r>
     </w:p>
     <w:p>
@@ -6222,7 +6207,7 @@
       <w:r>
         <w:drawing>
           <wp:inline distT="0" distB="0" distL="0" distR="0">
-            <wp:extent cx="5762625" cy="2209800"/>
+            <wp:extent cx="5486400" cy="2105025"/>
             <wp:effectExtent t="0" r="0" b="0" l="0"/>
             <wp:docPr id="3" name="Figure_3" descr="Contribution of knowledge sources. (a) Exact group-Shapley values of the five feature groups over all 32 coalitions (cross-validated AUC above 0.5; share of the total in brackets). (b) AUC lost when one group is removed from the full model." title="Figure 3"/>
             <wp:cNvGraphicFramePr>
@@ -6247,7 +6232,7 @@
                   <pic:spPr bwMode="auto">
                     <a:xfrm>
                       <a:off x="0" y="0"/>
-                      <a:ext cx="5762625" cy="2209800"/>
+                      <a:ext cx="5486400" cy="2105025"/>
                     </a:xfrm>
                     <a:prstGeom prst="rect">
                       <a:avLst/>
@@ -6307,7 +6292,7 @@
       <w:r>
         <w:drawing>
           <wp:inline distT="0" distB="0" distL="0" distR="0">
-            <wp:extent cx="5848350" cy="1876425"/>
+            <wp:extent cx="5667375" cy="1809750"/>
             <wp:effectExtent t="0" r="0" b="0" l="0"/>
             <wp:docPr id="4" name="Figure_4" descr="Knowledge-consistent behaviour. (a) Share of startups whose individual predicted exit probability decreases somewhere along a constrained feature, without and with K5. (b–d) Partial dependence of KEXS on three knowledge features (mean log-odds of exit)." title="Figure 4"/>
             <wp:cNvGraphicFramePr>
@@ -6332,7 +6317,7 @@
                   <pic:spPr bwMode="auto">
                     <a:xfrm>
                       <a:off x="0" y="0"/>
-                      <a:ext cx="5848350" cy="1876425"/>
+                      <a:ext cx="5667375" cy="1809750"/>
                     </a:xfrm>
                     <a:prstGeom prst="rect">
                       <a:avLst/>
@@ -6381,7 +6366,7 @@
           <w:sz w:val="24"/>
           <w:szCs w:val="24"/>
         </w:rPr>
-        <w:t xml:space="preserve">These results place KEXS within knowledge-based decision support: a score is produced because a startup's profile matches codified domain knowledge, the contribution of each knowledge source is measurable, and the model's behaviour is guaranteed to respect explicit expert rules. For investors and accelerators KEXS offers an auditable screening score; for researchers, the group-Shapley protocol offers a reusable test of whether a theory-derived feature set adds information beyond raw data, as advocated for high-stakes decisions [13].</w:t>
+        <w:t xml:space="preserve">These results place KEXS within knowledge-based decision support: each knowledge source's contribution is measurable and the model's behaviour provably respects explicit expert rules. For investors and accelerators this yields an auditable first-stage screening score that can be defended to an investment committee, because no startup is ever penalised for raising more capital or reaching a later stage. For researchers, the group-Shapley protocol is a reusable test of whether a theory-derived feature set adds information beyond raw data, in line with calls for inherently trustworthy models in high-stakes decisions [13].</w:t>
       </w:r>
     </w:p>
     <w:p>
@@ -6427,7 +6412,7 @@
           <w:sz w:val="24"/>
           <w:szCs w:val="24"/>
         </w:rPr>
-        <w:t xml:space="preserve">The improvement over the strongest data-only learner is statistically robust but small in absolute terms, and deep tabular architectures and large language model-based predictors were not evaluated. Future work should test KEXS on recent data, add founder, team and investor knowledge, and replace the static category graph with a heterogeneous knowledge graph of firms, investors and people.</w:t>
+        <w:t xml:space="preserve">The accuracy gain is statistically robust but small in absolute terms, and deep tabular and large language model-based predictors were not evaluated. Future work should test KEXS on recent data and extend K2 to a heterogeneous knowledge graph of firms, investors and founders.</w:t>
       </w:r>
     </w:p>
     <w:p>
@@ -6479,7 +6464,7 @@
     </w:p>
     <w:p>
       <w:pPr>
-        <w:spacing w:after="0" w:line="480"/>
+        <w:spacing w:after="0" w:line="300"/>
         <w:ind w:firstLine="0"/>
         <w:jc w:val="both"/>
       </w:pPr>
@@ -6510,7 +6495,7 @@
     </w:p>
     <w:p>
       <w:pPr>
-        <w:spacing w:after="0" w:line="480"/>
+        <w:spacing w:after="0" w:line="300"/>
         <w:ind w:firstLine="0"/>
         <w:jc w:val="both"/>
       </w:pPr>
@@ -6541,7 +6526,7 @@
     </w:p>
     <w:p>
       <w:pPr>
-        <w:spacing w:after="0" w:line="480"/>
+        <w:spacing w:after="0" w:line="300"/>
         <w:ind w:firstLine="0"/>
         <w:jc w:val="both"/>
       </w:pPr>
@@ -6551,7 +6536,7 @@
           <w:sz w:val="24"/>
           <w:szCs w:val="24"/>
         </w:rPr>
-        <w:t xml:space="preserve">During the preparation of this work the author used Claude (Anthropic) to assist with code development, analysis and drafting of the manuscript. After using this tool, the author reviewed and edited the content as needed and takes full responsibility for the content of the published article. All experimental results, tables and figures were generated by executable code from the public dataset.</w:t>
+        <w:t xml:space="preserve">During the preparation of this work the author used Claude (Anthropic) to assist with code development, data analysis and drafting of the manuscript. After using this tool, the author reviewed and edited the content as needed and takes full responsibility for the content of the published article.</w:t>
       </w:r>
     </w:p>
     <w:p>
@@ -6572,7 +6557,7 @@
     </w:p>
     <w:p>
       <w:pPr>
-        <w:spacing w:after="0" w:line="480"/>
+        <w:spacing w:after="0" w:line="300"/>
         <w:ind w:firstLine="0"/>
         <w:jc w:val="both"/>
       </w:pPr>
@@ -6603,7 +6588,7 @@
     </w:p>
     <w:p>
       <w:pPr>
-        <w:spacing w:after="0" w:line="480"/>
+        <w:spacing w:after="0" w:line="300"/>
         <w:ind w:firstLine="0"/>
         <w:jc w:val="both"/>
       </w:pPr>
@@ -6634,528 +6619,528 @@
     </w:p>
     <w:p>
       <w:pPr>
-        <w:spacing w:after="40" w:line="360"/>
+        <w:spacing w:after="40" w:line="240"/>
         <w:ind w:left="480" w:hanging="480"/>
       </w:pPr>
       <w:r>
         <w:rPr>
           <w:rFonts w:ascii="Times New Roman" w:cs="Times New Roman" w:eastAsia="Times New Roman" w:hAnsi="Times New Roman"/>
-          <w:sz w:val="22"/>
-          <w:szCs w:val="22"/>
+          <w:sz w:val="20"/>
+          <w:szCs w:val="20"/>
         </w:rPr>
         <w:t xml:space="preserve">[1]	</w:t>
       </w:r>
       <w:r>
         <w:rPr>
           <w:rFonts w:ascii="Times New Roman" w:cs="Times New Roman" w:eastAsia="Times New Roman" w:hAnsi="Times New Roman"/>
-          <w:sz w:val="22"/>
-          <w:szCs w:val="22"/>
+          <w:sz w:val="20"/>
+          <w:szCs w:val="20"/>
         </w:rPr>
         <w:t xml:space="preserve">A. Krishna, A. Agrawal, A. Choudhary, Predicting the outcome of startups: less failure, more success, in: 2016 IEEE 16th Int. Conf. Data Mining Workshops (ICDMW), IEEE, 2016, pp. 798–805. https://doi.org/10.1109/ICDMW.2016.0118.</w:t>
       </w:r>
     </w:p>
     <w:p>
       <w:pPr>
-        <w:spacing w:after="40" w:line="360"/>
+        <w:spacing w:after="40" w:line="240"/>
         <w:ind w:left="480" w:hanging="480"/>
       </w:pPr>
       <w:r>
         <w:rPr>
           <w:rFonts w:ascii="Times New Roman" w:cs="Times New Roman" w:eastAsia="Times New Roman" w:hAnsi="Times New Roman"/>
-          <w:sz w:val="22"/>
-          <w:szCs w:val="22"/>
+          <w:sz w:val="20"/>
+          <w:szCs w:val="20"/>
         </w:rPr>
         <w:t xml:space="preserve">[2]	</w:t>
       </w:r>
       <w:r>
         <w:rPr>
           <w:rFonts w:ascii="Times New Roman" w:cs="Times New Roman" w:eastAsia="Times New Roman" w:hAnsi="Times New Roman"/>
-          <w:sz w:val="22"/>
-          <w:szCs w:val="22"/>
-        </w:rPr>
-        <w:t xml:space="preserve">M. Razaghzadeh Bidgoli, I. Raeesi Vanani, M. Goodarzi, Predicting the success of startups using a machine learning approach, J. Innov. Entrep. 13 (2024). https://doi.org/10.1186/s13731-024-00436-x.</w:t>
-      </w:r>
-    </w:p>
-    <w:p>
-      <w:pPr>
-        <w:spacing w:after="40" w:line="360"/>
+          <w:sz w:val="20"/>
+          <w:szCs w:val="20"/>
+        </w:rPr>
+        <w:t xml:space="preserve">M. Razaghzadeh Bidgoli, I. Raeesi Vanani, M. Goodarzi, Predicting the success of startups using a machine learning approach, J. Innov. Entrep. 13 (2024) 80. https://doi.org/10.1186/s13731-024-00436-x.</w:t>
+      </w:r>
+    </w:p>
+    <w:p>
+      <w:pPr>
+        <w:spacing w:after="40" w:line="240"/>
         <w:ind w:left="480" w:hanging="480"/>
       </w:pPr>
       <w:r>
         <w:rPr>
           <w:rFonts w:ascii="Times New Roman" w:cs="Times New Roman" w:eastAsia="Times New Roman" w:hAnsi="Times New Roman"/>
-          <w:sz w:val="22"/>
-          <w:szCs w:val="22"/>
+          <w:sz w:val="20"/>
+          <w:szCs w:val="20"/>
         </w:rPr>
         <w:t xml:space="preserve">[3]	</w:t>
       </w:r>
       <w:r>
         <w:rPr>
           <w:rFonts w:ascii="Times New Roman" w:cs="Times New Roman" w:eastAsia="Times New Roman" w:hAnsi="Times New Roman"/>
-          <w:sz w:val="22"/>
-          <w:szCs w:val="22"/>
+          <w:sz w:val="20"/>
+          <w:szCs w:val="20"/>
         </w:rPr>
         <w:t xml:space="preserve">J. Arroyo, F. Corea, G. Jiménez-Díaz, J.A. Recio-García, Assessment of machine learning performance for decision support in venture capital investments, IEEE Access 7 (2019) 124233–124243. https://doi.org/10.1109/ACCESS.2019.2938659.</w:t>
       </w:r>
     </w:p>
     <w:p>
       <w:pPr>
-        <w:spacing w:after="40" w:line="360"/>
+        <w:spacing w:after="40" w:line="240"/>
         <w:ind w:left="480" w:hanging="480"/>
       </w:pPr>
       <w:r>
         <w:rPr>
           <w:rFonts w:ascii="Times New Roman" w:cs="Times New Roman" w:eastAsia="Times New Roman" w:hAnsi="Times New Roman"/>
-          <w:sz w:val="22"/>
-          <w:szCs w:val="22"/>
+          <w:sz w:val="20"/>
+          <w:szCs w:val="20"/>
         </w:rPr>
         <w:t xml:space="preserve">[4]	</w:t>
       </w:r>
       <w:r>
         <w:rPr>
           <w:rFonts w:ascii="Times New Roman" w:cs="Times New Roman" w:eastAsia="Times New Roman" w:hAnsi="Times New Roman"/>
-          <w:sz w:val="22"/>
-          <w:szCs w:val="22"/>
+          <w:sz w:val="20"/>
+          <w:szCs w:val="20"/>
         </w:rPr>
         <w:t xml:space="preserve">K. Żbikowski, P. Antosiuk, A machine learning, bias-free approach for predicting business success using Crunchbase data, Inf. Process. Manag. 58 (4) (2021) 102555. https://doi.org/10.1016/j.ipm.2021.102555.</w:t>
       </w:r>
     </w:p>
     <w:p>
       <w:pPr>
-        <w:spacing w:after="40" w:line="360"/>
+        <w:spacing w:after="40" w:line="240"/>
         <w:ind w:left="480" w:hanging="480"/>
       </w:pPr>
       <w:r>
         <w:rPr>
           <w:rFonts w:ascii="Times New Roman" w:cs="Times New Roman" w:eastAsia="Times New Roman" w:hAnsi="Times New Roman"/>
-          <w:sz w:val="22"/>
-          <w:szCs w:val="22"/>
+          <w:sz w:val="20"/>
+          <w:szCs w:val="20"/>
         </w:rPr>
         <w:t xml:space="preserve">[5]	</w:t>
       </w:r>
       <w:r>
         <w:rPr>
           <w:rFonts w:ascii="Times New Roman" w:cs="Times New Roman" w:eastAsia="Times New Roman" w:hAnsi="Times New Roman"/>
-          <w:sz w:val="22"/>
-          <w:szCs w:val="22"/>
-        </w:rPr>
-        <w:t xml:space="preserve">J. Park, S. Choi, Y. Feng, Predicting startup success using two bias-free machine learning: resolving data imbalance using generative adversarial networks, J. Big Data 11 (2024). https://doi.org/10.1186/s40537-024-00993-8.</w:t>
-      </w:r>
-    </w:p>
-    <w:p>
-      <w:pPr>
-        <w:spacing w:after="40" w:line="360"/>
+          <w:sz w:val="20"/>
+          <w:szCs w:val="20"/>
+        </w:rPr>
+        <w:t xml:space="preserve">J. Park, S. Choi, Y. Feng, Predicting startup success using two bias-free machine learning: resolving data imbalance using generative adversarial networks, J. Big Data 11 (2024) 122. https://doi.org/10.1186/s40537-024-00993-8.</w:t>
+      </w:r>
+    </w:p>
+    <w:p>
+      <w:pPr>
+        <w:spacing w:after="40" w:line="240"/>
         <w:ind w:left="480" w:hanging="480"/>
       </w:pPr>
       <w:r>
         <w:rPr>
           <w:rFonts w:ascii="Times New Roman" w:cs="Times New Roman" w:eastAsia="Times New Roman" w:hAnsi="Times New Roman"/>
-          <w:sz w:val="22"/>
-          <w:szCs w:val="22"/>
+          <w:sz w:val="20"/>
+          <w:szCs w:val="20"/>
         </w:rPr>
         <w:t xml:space="preserve">[6]	</w:t>
       </w:r>
       <w:r>
         <w:rPr>
           <w:rFonts w:ascii="Times New Roman" w:cs="Times New Roman" w:eastAsia="Times New Roman" w:hAnsi="Times New Roman"/>
-          <w:sz w:val="22"/>
-          <w:szCs w:val="22"/>
+          <w:sz w:val="20"/>
+          <w:szCs w:val="20"/>
         </w:rPr>
         <w:t xml:space="preserve">G. Ross, S.R. Das, D. Sciro, H. Raza, CapitalVX: A machine learning model for startup selection and exit prediction, J. Finance Data Sci. 7 (2021) 94–114. https://doi.org/10.1016/j.jfds.2021.04.001.</w:t>
       </w:r>
     </w:p>
     <w:p>
       <w:pPr>
-        <w:spacing w:after="40" w:line="360"/>
+        <w:spacing w:after="40" w:line="240"/>
         <w:ind w:left="480" w:hanging="480"/>
       </w:pPr>
       <w:r>
         <w:rPr>
           <w:rFonts w:ascii="Times New Roman" w:cs="Times New Roman" w:eastAsia="Times New Roman" w:hAnsi="Times New Roman"/>
-          <w:sz w:val="22"/>
-          <w:szCs w:val="22"/>
+          <w:sz w:val="20"/>
+          <w:szCs w:val="20"/>
         </w:rPr>
         <w:t xml:space="preserve">[7]	</w:t>
       </w:r>
       <w:r>
         <w:rPr>
           <w:rFonts w:ascii="Times New Roman" w:cs="Times New Roman" w:eastAsia="Times New Roman" w:hAnsi="Times New Roman"/>
-          <w:sz w:val="22"/>
-          <w:szCs w:val="22"/>
+          <w:sz w:val="20"/>
+          <w:szCs w:val="20"/>
         </w:rPr>
         <w:t xml:space="preserve">M. Potanin, A. Chertok, K. Zorin, C. Shtabtsovsky, Startup success prediction and VC portfolio simulation using CrunchBase data, arXiv preprint (2023). https://doi.org/10.48550/arXiv.2309.15552.</w:t>
       </w:r>
     </w:p>
     <w:p>
       <w:pPr>
-        <w:spacing w:after="40" w:line="360"/>
+        <w:spacing w:after="40" w:line="240"/>
         <w:ind w:left="480" w:hanging="480"/>
       </w:pPr>
       <w:r>
         <w:rPr>
           <w:rFonts w:ascii="Times New Roman" w:cs="Times New Roman" w:eastAsia="Times New Roman" w:hAnsi="Times New Roman"/>
-          <w:sz w:val="22"/>
-          <w:szCs w:val="22"/>
+          <w:sz w:val="20"/>
+          <w:szCs w:val="20"/>
         </w:rPr>
         <w:t xml:space="preserve">[8]	</w:t>
       </w:r>
       <w:r>
         <w:rPr>
           <w:rFonts w:ascii="Times New Roman" w:cs="Times New Roman" w:eastAsia="Times New Roman" w:hAnsi="Times New Roman"/>
-          <w:sz w:val="22"/>
-          <w:szCs w:val="22"/>
+          <w:sz w:val="20"/>
+          <w:szCs w:val="20"/>
         </w:rPr>
         <w:t xml:space="preserve">S.M.A. Jafari, A. Mobini Dehkordi, E. Chitsaz, Y. Yaghoobzadeh, What matters most? A quantitative meta-analysis of AI-based predictors for startup success, arXiv preprint (2025). https://doi.org/10.48550/arXiv.2507.09675.</w:t>
       </w:r>
     </w:p>
     <w:p>
       <w:pPr>
-        <w:spacing w:after="40" w:line="360"/>
+        <w:spacing w:after="40" w:line="240"/>
         <w:ind w:left="480" w:hanging="480"/>
       </w:pPr>
       <w:r>
         <w:rPr>
           <w:rFonts w:ascii="Times New Roman" w:cs="Times New Roman" w:eastAsia="Times New Roman" w:hAnsi="Times New Roman"/>
-          <w:sz w:val="22"/>
-          <w:szCs w:val="22"/>
+          <w:sz w:val="20"/>
+          <w:szCs w:val="20"/>
         </w:rPr>
         <w:t xml:space="preserve">[9]	</w:t>
       </w:r>
       <w:r>
         <w:rPr>
           <w:rFonts w:ascii="Times New Roman" w:cs="Times New Roman" w:eastAsia="Times New Roman" w:hAnsi="Times New Roman"/>
-          <w:sz w:val="22"/>
-          <w:szCs w:val="22"/>
+          <w:sz w:val="20"/>
+          <w:szCs w:val="20"/>
         </w:rPr>
         <w:t xml:space="preserve">P.A. Gompers, Optimal investment, monitoring, and the staging of venture capital, J. Finance 50 (5) (1995) 1461–1489. https://doi.org/10.1111/j.1540-6261.1995.tb05185.x.</w:t>
       </w:r>
     </w:p>
     <w:p>
       <w:pPr>
-        <w:spacing w:after="40" w:line="360"/>
+        <w:spacing w:after="40" w:line="240"/>
         <w:ind w:left="480" w:hanging="480"/>
       </w:pPr>
       <w:r>
         <w:rPr>
           <w:rFonts w:ascii="Times New Roman" w:cs="Times New Roman" w:eastAsia="Times New Roman" w:hAnsi="Times New Roman"/>
-          <w:sz w:val="22"/>
-          <w:szCs w:val="22"/>
+          <w:sz w:val="20"/>
+          <w:szCs w:val="20"/>
         </w:rPr>
         <w:t xml:space="preserve">[10]	</w:t>
       </w:r>
       <w:r>
         <w:rPr>
           <w:rFonts w:ascii="Times New Roman" w:cs="Times New Roman" w:eastAsia="Times New Roman" w:hAnsi="Times New Roman"/>
-          <w:sz w:val="22"/>
-          <w:szCs w:val="22"/>
+          <w:sz w:val="20"/>
+          <w:szCs w:val="20"/>
         </w:rPr>
         <w:t xml:space="preserve">B.L. Connelly, S.T. Certo, R.D. Ireland, C.R. Reutzel, Signaling theory: a review and assessment, J. Manag. 37 (1) (2011) 39–67. https://doi.org/10.1177/0149206310388419.</w:t>
       </w:r>
     </w:p>
     <w:p>
       <w:pPr>
-        <w:spacing w:after="40" w:line="360"/>
+        <w:spacing w:after="40" w:line="240"/>
         <w:ind w:left="480" w:hanging="480"/>
       </w:pPr>
       <w:r>
         <w:rPr>
           <w:rFonts w:ascii="Times New Roman" w:cs="Times New Roman" w:eastAsia="Times New Roman" w:hAnsi="Times New Roman"/>
-          <w:sz w:val="22"/>
-          <w:szCs w:val="22"/>
+          <w:sz w:val="20"/>
+          <w:szCs w:val="20"/>
         </w:rPr>
         <w:t xml:space="preserve">[11]	</w:t>
       </w:r>
       <w:r>
         <w:rPr>
           <w:rFonts w:ascii="Times New Roman" w:cs="Times New Roman" w:eastAsia="Times New Roman" w:hAnsi="Times New Roman"/>
-          <w:sz w:val="22"/>
-          <w:szCs w:val="22"/>
+          <w:sz w:val="20"/>
+          <w:szCs w:val="20"/>
         </w:rPr>
         <w:t xml:space="preserve">M. Delgado, M.E. Porter, S. Stern, Clusters and entrepreneurship, J. Econ. Geogr. 10 (4) (2010) 495–518. https://doi.org/10.1093/jeg/lbq010.</w:t>
       </w:r>
     </w:p>
     <w:p>
       <w:pPr>
-        <w:spacing w:after="40" w:line="360"/>
+        <w:spacing w:after="40" w:line="240"/>
         <w:ind w:left="480" w:hanging="480"/>
       </w:pPr>
       <w:r>
         <w:rPr>
           <w:rFonts w:ascii="Times New Roman" w:cs="Times New Roman" w:eastAsia="Times New Roman" w:hAnsi="Times New Roman"/>
-          <w:sz w:val="22"/>
-          <w:szCs w:val="22"/>
+          <w:sz w:val="20"/>
+          <w:szCs w:val="20"/>
         </w:rPr>
         <w:t xml:space="preserve">[12]	</w:t>
       </w:r>
       <w:r>
         <w:rPr>
           <w:rFonts w:ascii="Times New Roman" w:cs="Times New Roman" w:eastAsia="Times New Roman" w:hAnsi="Times New Roman"/>
-          <w:sz w:val="22"/>
-          <w:szCs w:val="22"/>
+          <w:sz w:val="20"/>
+          <w:szCs w:val="20"/>
         </w:rPr>
         <w:t xml:space="preserve">E. Stam, Entrepreneurial ecosystems and regional policy: a sympathetic critique, Eur. Plan. Stud. 23 (9) (2015) 1759–1769. https://doi.org/10.1080/09654313.2015.1061484.</w:t>
       </w:r>
     </w:p>
     <w:p>
       <w:pPr>
-        <w:spacing w:after="40" w:line="360"/>
+        <w:spacing w:after="40" w:line="240"/>
         <w:ind w:left="480" w:hanging="480"/>
       </w:pPr>
       <w:r>
         <w:rPr>
           <w:rFonts w:ascii="Times New Roman" w:cs="Times New Roman" w:eastAsia="Times New Roman" w:hAnsi="Times New Roman"/>
-          <w:sz w:val="22"/>
-          <w:szCs w:val="22"/>
+          <w:sz w:val="20"/>
+          <w:szCs w:val="20"/>
         </w:rPr>
         <w:t xml:space="preserve">[13]	</w:t>
       </w:r>
       <w:r>
         <w:rPr>
           <w:rFonts w:ascii="Times New Roman" w:cs="Times New Roman" w:eastAsia="Times New Roman" w:hAnsi="Times New Roman"/>
-          <w:sz w:val="22"/>
-          <w:szCs w:val="22"/>
+          <w:sz w:val="20"/>
+          <w:szCs w:val="20"/>
         </w:rPr>
         <w:t xml:space="preserve">C. Rudin, Stop explaining black box machine learning models for high stakes decisions and use interpretable models instead, Nat. Mach. Intell. 1 (5) (2019) 206–215. https://doi.org/10.1038/s42256-019-0048-x.</w:t>
       </w:r>
     </w:p>
     <w:p>
       <w:pPr>
-        <w:spacing w:after="40" w:line="360"/>
+        <w:spacing w:after="40" w:line="240"/>
         <w:ind w:left="480" w:hanging="480"/>
       </w:pPr>
       <w:r>
         <w:rPr>
           <w:rFonts w:ascii="Times New Roman" w:cs="Times New Roman" w:eastAsia="Times New Roman" w:hAnsi="Times New Roman"/>
-          <w:sz w:val="22"/>
-          <w:szCs w:val="22"/>
+          <w:sz w:val="20"/>
+          <w:szCs w:val="20"/>
         </w:rPr>
         <w:t xml:space="preserve">[14]	</w:t>
       </w:r>
       <w:r>
         <w:rPr>
           <w:rFonts w:ascii="Times New Roman" w:cs="Times New Roman" w:eastAsia="Times New Roman" w:hAnsi="Times New Roman"/>
-          <w:sz w:val="22"/>
-          <w:szCs w:val="22"/>
+          <w:sz w:val="20"/>
+          <w:szCs w:val="20"/>
         </w:rPr>
         <w:t xml:space="preserve">L. von Rueden, S. Mayer, K. Beckh, B. Georgiev, S. Giesselbach, R. Heese, B. Kirsch, J. Pfrommer, A. Pick, R. Ramamurthy, M. Walczak, J. Garcke, C. Bauckhage, J. Schuecker, Informed machine learning – a taxonomy and survey of integrating prior knowledge into learning systems, IEEE Trans. Knowl. Data Eng. 35 (1) (2023) 614–633. https://doi.org/10.1109/TKDE.2021.3079836.</w:t>
       </w:r>
     </w:p>
     <w:p>
       <w:pPr>
-        <w:spacing w:after="40" w:line="360"/>
+        <w:spacing w:after="40" w:line="240"/>
         <w:ind w:left="480" w:hanging="480"/>
       </w:pPr>
       <w:r>
         <w:rPr>
           <w:rFonts w:ascii="Times New Roman" w:cs="Times New Roman" w:eastAsia="Times New Roman" w:hAnsi="Times New Roman"/>
-          <w:sz w:val="22"/>
-          <w:szCs w:val="22"/>
+          <w:sz w:val="20"/>
+          <w:szCs w:val="20"/>
         </w:rPr>
         <w:t xml:space="preserve">[15]	</w:t>
       </w:r>
       <w:r>
         <w:rPr>
           <w:rFonts w:ascii="Times New Roman" w:cs="Times New Roman" w:eastAsia="Times New Roman" w:hAnsi="Times New Roman"/>
-          <w:sz w:val="22"/>
-          <w:szCs w:val="22"/>
+          <w:sz w:val="20"/>
+          <w:szCs w:val="20"/>
         </w:rPr>
         <w:t xml:space="preserve">Z. Gao, Y. Xiao, Enhancing startup success predictions in venture capital: a GraphRAG augmented multivariate time series method, arXiv preprint (2024). https://doi.org/10.48550/arXiv.2408.09420.</w:t>
       </w:r>
     </w:p>
     <w:p>
       <w:pPr>
-        <w:spacing w:after="40" w:line="360"/>
+        <w:spacing w:after="40" w:line="240"/>
         <w:ind w:left="480" w:hanging="480"/>
       </w:pPr>
       <w:r>
         <w:rPr>
           <w:rFonts w:ascii="Times New Roman" w:cs="Times New Roman" w:eastAsia="Times New Roman" w:hAnsi="Times New Roman"/>
-          <w:sz w:val="22"/>
-          <w:szCs w:val="22"/>
+          <w:sz w:val="20"/>
+          <w:szCs w:val="20"/>
         </w:rPr>
         <w:t xml:space="preserve">[16]	</w:t>
       </w:r>
       <w:r>
         <w:rPr>
           <w:rFonts w:ascii="Times New Roman" w:cs="Times New Roman" w:eastAsia="Times New Roman" w:hAnsi="Times New Roman"/>
-          <w:sz w:val="22"/>
-          <w:szCs w:val="22"/>
+          <w:sz w:val="20"/>
+          <w:szCs w:val="20"/>
         </w:rPr>
         <w:t xml:space="preserve">arindam235 (Kaggle user), StartUp Investments (Crunchbase) [dataset], Kaggle. https://www.kaggle.com/datasets/arindam235/startup-investments-crunchbase, (accessed 23 October 2026).</w:t>
       </w:r>
     </w:p>
     <w:p>
       <w:pPr>
-        <w:spacing w:after="40" w:line="360"/>
+        <w:spacing w:after="40" w:line="240"/>
         <w:ind w:left="480" w:hanging="480"/>
       </w:pPr>
       <w:r>
         <w:rPr>
           <w:rFonts w:ascii="Times New Roman" w:cs="Times New Roman" w:eastAsia="Times New Roman" w:hAnsi="Times New Roman"/>
-          <w:sz w:val="22"/>
-          <w:szCs w:val="22"/>
+          <w:sz w:val="20"/>
+          <w:szCs w:val="20"/>
         </w:rPr>
         <w:t xml:space="preserve">[17]	</w:t>
       </w:r>
       <w:r>
         <w:rPr>
           <w:rFonts w:ascii="Times New Roman" w:cs="Times New Roman" w:eastAsia="Times New Roman" w:hAnsi="Times New Roman"/>
-          <w:sz w:val="22"/>
-          <w:szCs w:val="22"/>
+          <w:sz w:val="20"/>
+          <w:szCs w:val="20"/>
         </w:rPr>
         <w:t xml:space="preserve">O. Levy, Y. Goldberg, Neural word embedding as implicit matrix factorization, in: Adv. Neural Inf. Process. Syst. 27, 2014, pp. 2177–2185.</w:t>
       </w:r>
     </w:p>
     <w:p>
       <w:pPr>
-        <w:spacing w:after="40" w:line="360"/>
+        <w:spacing w:after="40" w:line="240"/>
         <w:ind w:left="480" w:hanging="480"/>
       </w:pPr>
       <w:r>
         <w:rPr>
           <w:rFonts w:ascii="Times New Roman" w:cs="Times New Roman" w:eastAsia="Times New Roman" w:hAnsi="Times New Roman"/>
-          <w:sz w:val="22"/>
-          <w:szCs w:val="22"/>
+          <w:sz w:val="20"/>
+          <w:szCs w:val="20"/>
         </w:rPr>
         <w:t xml:space="preserve">[18]	</w:t>
       </w:r>
       <w:r>
         <w:rPr>
           <w:rFonts w:ascii="Times New Roman" w:cs="Times New Roman" w:eastAsia="Times New Roman" w:hAnsi="Times New Roman"/>
-          <w:sz w:val="22"/>
-          <w:szCs w:val="22"/>
+          <w:sz w:val="20"/>
+          <w:szCs w:val="20"/>
         </w:rPr>
         <w:t xml:space="preserve">J.H. Friedman, Greedy function approximation: a gradient boosting machine, Ann. Stat. 29 (5) (2001) 1189–1232. https://doi.org/10.1214/aos/1013203451.</w:t>
       </w:r>
     </w:p>
     <w:p>
       <w:pPr>
-        <w:spacing w:after="40" w:line="360"/>
+        <w:spacing w:after="40" w:line="240"/>
         <w:ind w:left="480" w:hanging="480"/>
       </w:pPr>
       <w:r>
         <w:rPr>
           <w:rFonts w:ascii="Times New Roman" w:cs="Times New Roman" w:eastAsia="Times New Roman" w:hAnsi="Times New Roman"/>
-          <w:sz w:val="22"/>
-          <w:szCs w:val="22"/>
+          <w:sz w:val="20"/>
+          <w:szCs w:val="20"/>
         </w:rPr>
         <w:t xml:space="preserve">[19]	</w:t>
       </w:r>
       <w:r>
         <w:rPr>
           <w:rFonts w:ascii="Times New Roman" w:cs="Times New Roman" w:eastAsia="Times New Roman" w:hAnsi="Times New Roman"/>
-          <w:sz w:val="22"/>
-          <w:szCs w:val="22"/>
+          <w:sz w:val="20"/>
+          <w:szCs w:val="20"/>
         </w:rPr>
         <w:t xml:space="preserve">G. Ke, Q. Meng, T. Finley, T. Wang, W. Chen, W. Ma, Q. Ye, T.-Y. Liu, LightGBM: a highly efficient gradient boosting decision tree, in: Adv. Neural Inf. Process. Syst. 30, 2017, pp. 3146–3154.</w:t>
       </w:r>
     </w:p>
     <w:p>
       <w:pPr>
-        <w:spacing w:after="40" w:line="360"/>
+        <w:spacing w:after="40" w:line="240"/>
         <w:ind w:left="480" w:hanging="480"/>
       </w:pPr>
       <w:r>
         <w:rPr>
           <w:rFonts w:ascii="Times New Roman" w:cs="Times New Roman" w:eastAsia="Times New Roman" w:hAnsi="Times New Roman"/>
-          <w:sz w:val="22"/>
-          <w:szCs w:val="22"/>
+          <w:sz w:val="20"/>
+          <w:szCs w:val="20"/>
         </w:rPr>
         <w:t xml:space="preserve">[20]	</w:t>
       </w:r>
       <w:r>
         <w:rPr>
           <w:rFonts w:ascii="Times New Roman" w:cs="Times New Roman" w:eastAsia="Times New Roman" w:hAnsi="Times New Roman"/>
-          <w:sz w:val="22"/>
-          <w:szCs w:val="22"/>
+          <w:sz w:val="20"/>
+          <w:szCs w:val="20"/>
         </w:rPr>
         <w:t xml:space="preserve">S.M. Lundberg, S.-I. Lee, A unified approach to interpreting model predictions, in: Adv. Neural Inf. Process. Syst. 30, 2017, pp. 4765–4774.</w:t>
       </w:r>
     </w:p>
     <w:p>
       <w:pPr>
-        <w:spacing w:after="40" w:line="360"/>
+        <w:spacing w:after="40" w:line="240"/>
         <w:ind w:left="480" w:hanging="480"/>
       </w:pPr>
       <w:r>
         <w:rPr>
           <w:rFonts w:ascii="Times New Roman" w:cs="Times New Roman" w:eastAsia="Times New Roman" w:hAnsi="Times New Roman"/>
-          <w:sz w:val="22"/>
-          <w:szCs w:val="22"/>
+          <w:sz w:val="20"/>
+          <w:szCs w:val="20"/>
         </w:rPr>
         <w:t xml:space="preserve">[21]	</w:t>
       </w:r>
       <w:r>
         <w:rPr>
           <w:rFonts w:ascii="Times New Roman" w:cs="Times New Roman" w:eastAsia="Times New Roman" w:hAnsi="Times New Roman"/>
-          <w:sz w:val="22"/>
-          <w:szCs w:val="22"/>
+          <w:sz w:val="20"/>
+          <w:szCs w:val="20"/>
         </w:rPr>
         <w:t xml:space="preserve">I. Covert, S.M. Lundberg, S.-I. Lee, Understanding global feature contributions with additive importance measures, in: Adv. Neural Inf. Process. Syst. 33, 2020, pp. 17212–17223.</w:t>
       </w:r>
     </w:p>
     <w:p>
       <w:pPr>
-        <w:spacing w:after="40" w:line="360"/>
+        <w:spacing w:after="40" w:line="240"/>
         <w:ind w:left="480" w:hanging="480"/>
       </w:pPr>
       <w:r>
         <w:rPr>
           <w:rFonts w:ascii="Times New Roman" w:cs="Times New Roman" w:eastAsia="Times New Roman" w:hAnsi="Times New Roman"/>
-          <w:sz w:val="22"/>
-          <w:szCs w:val="22"/>
+          <w:sz w:val="20"/>
+          <w:szCs w:val="20"/>
         </w:rPr>
         <w:t xml:space="preserve">[22]	</w:t>
       </w:r>
       <w:r>
         <w:rPr>
           <w:rFonts w:ascii="Times New Roman" w:cs="Times New Roman" w:eastAsia="Times New Roman" w:hAnsi="Times New Roman"/>
-          <w:sz w:val="22"/>
-          <w:szCs w:val="22"/>
+          <w:sz w:val="20"/>
+          <w:szCs w:val="20"/>
         </w:rPr>
         <w:t xml:space="preserve">C. Nadeau, Y. Bengio, Inference for the generalization error, Mach. Learn. 52 (3) (2003) 239–281. https://doi.org/10.1023/A:1024068626366.</w:t>
       </w:r>
     </w:p>
     <w:p>
       <w:pPr>
-        <w:spacing w:after="40" w:line="360"/>
+        <w:spacing w:after="40" w:line="240"/>
         <w:ind w:left="480" w:hanging="480"/>
       </w:pPr>
       <w:r>
         <w:rPr>
           <w:rFonts w:ascii="Times New Roman" w:cs="Times New Roman" w:eastAsia="Times New Roman" w:hAnsi="Times New Roman"/>
-          <w:sz w:val="22"/>
-          <w:szCs w:val="22"/>
+          <w:sz w:val="20"/>
+          <w:szCs w:val="20"/>
         </w:rPr>
         <w:t xml:space="preserve">[23]	</w:t>
       </w:r>
       <w:r>
         <w:rPr>
           <w:rFonts w:ascii="Times New Roman" w:cs="Times New Roman" w:eastAsia="Times New Roman" w:hAnsi="Times New Roman"/>
-          <w:sz w:val="22"/>
-          <w:szCs w:val="22"/>
+          <w:sz w:val="20"/>
+          <w:szCs w:val="20"/>
         </w:rPr>
         <w:t xml:space="preserve">F. Pedregosa, G. Varoquaux, A. Gramfort, V. Michel, B. Thirion, O. Grisel, et al., Scikit-learn: machine learning in Python, J. Mach. Learn. Res. 12 (2011) 2825–2830.</w:t>
       </w:r>
     </w:p>
     <w:p>
       <w:pPr>
-        <w:spacing w:after="40" w:line="360"/>
+        <w:spacing w:after="40" w:line="240"/>
         <w:ind w:left="480" w:hanging="480"/>
       </w:pPr>
       <w:r>
         <w:rPr>
           <w:rFonts w:ascii="Times New Roman" w:cs="Times New Roman" w:eastAsia="Times New Roman" w:hAnsi="Times New Roman"/>
-          <w:sz w:val="22"/>
-          <w:szCs w:val="22"/>
+          <w:sz w:val="20"/>
+          <w:szCs w:val="20"/>
         </w:rPr>
         <w:t xml:space="preserve">[24]	</w:t>
       </w:r>
       <w:r>
         <w:rPr>
           <w:rFonts w:ascii="Times New Roman" w:cs="Times New Roman" w:eastAsia="Times New Roman" w:hAnsi="Times New Roman"/>
-          <w:sz w:val="22"/>
-          <w:szCs w:val="22"/>
+          <w:sz w:val="20"/>
+          <w:szCs w:val="20"/>
         </w:rPr>
         <w:t xml:space="preserve">S.K. Bhagam, KEXS: Knowledge-Enhanced eXplainable Startup-success model [software], GitHub, 2026. https://github.com/SaiKrishnaBhagam/ai-sdi.</w:t>
       </w:r>

</xml_diff>

<commit_message>
Manuscript: simplify title block (name and email only)
Co-Authored-By: Claude Opus 5.5 <noreply@anthropic.com>
Claude-Session: https://claude.ai/code/session_01WRgK6kBj7HrBDhj733BbEk
</commit_message>
<xml_diff>
--- a/paper/manuscript.docx
+++ b/paper/manuscript.docx
@@ -45,39 +45,6 @@
         </w:rPr>
         <w:t xml:space="preserve">Sai Krishna Bhagam</w:t>
       </w:r>
-      <w:r>
-        <w:rPr>
-          <w:rFonts w:ascii="Times New Roman" w:cs="Times New Roman" w:eastAsia="Times New Roman" w:hAnsi="Times New Roman"/>
-          <w:sz w:val="24"/>
-          <w:szCs w:val="24"/>
-          <w:vertAlign w:val="superscript"/>
-        </w:rPr>
-        <w:t xml:space="preserve">a,*</w:t>
-      </w:r>
-    </w:p>
-    <w:p>
-      <w:pPr>
-        <w:spacing w:after="60" w:line="360"/>
-        <w:jc w:val="center"/>
-      </w:pPr>
-      <w:r>
-        <w:rPr>
-          <w:rFonts w:ascii="Times New Roman" w:cs="Times New Roman" w:eastAsia="Times New Roman" w:hAnsi="Times New Roman"/>
-          <w:sz w:val="24"/>
-          <w:szCs w:val="24"/>
-          <w:vertAlign w:val="superscript"/>
-        </w:rPr>
-        <w:t xml:space="preserve">a</w:t>
-      </w:r>
-      <w:r>
-        <w:rPr>
-          <w:rFonts w:ascii="Times New Roman" w:cs="Times New Roman" w:eastAsia="Times New Roman" w:hAnsi="Times New Roman"/>
-          <w:sz w:val="24"/>
-          <w:szCs w:val="24"/>
-          <w:highlight w:val="yellow"/>
-        </w:rPr>
-        <w:t xml:space="preserve">[Affiliation, City, Country]</w:t>
-      </w:r>
     </w:p>
     <w:p>
       <w:pPr>
@@ -90,7 +57,7 @@
           <w:sz w:val="22"/>
           <w:szCs w:val="22"/>
         </w:rPr>
-        <w:t xml:space="preserve">*Corresponding author. E-mail address: saikrishbhagamus@gmail.com</w:t>
+        <w:t xml:space="preserve">saikrishbhagamus@gmail.com</w:t>
       </w:r>
     </w:p>
     <w:p>

</xml_diff>